<commit_message>
fix(livrable): corrige une coquille de retranscription (« different » → « différend ») dans le .docx
Le fichier source 01-description-technique.md avait toujours le bon mot ; l'erreur avait
été introduite lors de l'assemblage manuel du document combiné pour la conversion
pandoc. Le document est maintenant régénéré par concaténation programmatique des
fichiers sources (plus de recopie manuelle), ce qui élimine ce risque pour les prochaines
régénérations.
</commit_message>
<xml_diff>
--- a/livrable/Vaillant_Renaud_Planifier_le_developpement_d_un_site_de_vente.docx
+++ b/livrable/Vaillant_Renaud_Planifier_le_developpement_d_un_site_de_vente.docx
@@ -15,7 +15,7 @@
             <w:pStyle w:val="TOCHeading"/>
           </w:pPr>
           <w:r>
-            <w:t xml:space="preserve">Table of Contents</w:t>
+            <w:t xml:space="preserve">Sommaire</w:t>
           </w:r>
         </w:p>
         <w:p>
@@ -5143,7 +5143,13 @@
         <w:t xml:space="preserve"> </w:t>
       </w:r>
       <w:r>
-        <w:t xml:space="preserve">puisqu’aucun développement n’a encore démarré. La répartition ci-dessous est un exemple illustratif de ce à quoi ressemblera le tableau une fois le développement engagé, pas l’état actuel.</w:t>
+        <w:t xml:space="preserve">puisqu’aucun développement n’a encore démarré. La répartition ci-dessous (§</w:t>
+      </w:r>
+      <w:r>
+        <w:t xml:space="preserve">“Photo du tableau”</w:t>
+      </w:r>
+      <w:r>
+        <w:t xml:space="preserve">) est un exemple illustratif de ce à quoi ressemblera le tableau une fois le développement engagé, pas l’état actuel.</w:t>
       </w:r>
     </w:p>
     <w:bookmarkEnd w:id="23"/>
@@ -5785,7 +5791,7 @@
         <w:t xml:space="preserve"> </w:t>
       </w:r>
       <w:r>
-        <w:t xml:space="preserve">: 26/10/2026 (jour ouvré ≈59, ~12 semaines), avec une marge de sécurité avant la limite des 3 mois fixée par le tournage.</w:t>
+        <w:t xml:space="preserve">: vers le jour ouvré 59 (~12 semaines), avec une marge de sécurité avant la limite des 3 mois fixée par le tournage.</w:t>
       </w:r>
     </w:p>
     <w:p>
@@ -5821,7 +5827,7 @@
         <w:t xml:space="preserve"> </w:t>
       </w:r>
       <w:r>
-        <w:t xml:space="preserve">: 04/12/2026 (jour ouvré ≈87, ~17,5 semaines), avant la limite des 4 mois fixée par la diffusion du reportage, suivi d’une semaine d’hypercare.</w:t>
+        <w:t xml:space="preserve">: vers le jour ouvré 87 (~17,5 semaines), avant la limite des 4 mois fixée par la diffusion du reportage, suivi d’une semaine d’hypercare.</w:t>
       </w:r>
     </w:p>
     <w:p>
@@ -6296,7 +6302,7 @@
     </w:p>
     <w:bookmarkEnd w:id="30"/>
     <w:bookmarkEnd w:id="31"/>
-    <w:bookmarkStart w:id="38" w:name="estimation-du-coût"/>
+    <w:bookmarkStart w:id="43" w:name="estimation-du-coût"/>
     <w:p>
       <w:pPr>
         <w:pStyle w:val="Heading1"/>
@@ -6453,12 +6459,12 @@
         <w:tblLook w:firstRow="1" w:lastRow="0" w:firstColumn="0" w:lastColumn="0" w:noHBand="0" w:noVBand="0" w:val="0020"/>
       </w:tblPr>
       <w:tblGrid>
-        <w:gridCol w:w="1320"/>
-        <w:gridCol w:w="1320"/>
-        <w:gridCol w:w="1320"/>
-        <w:gridCol w:w="1320"/>
-        <w:gridCol w:w="1320"/>
-        <w:gridCol w:w="1320"/>
+        <w:gridCol w:w="1131"/>
+        <w:gridCol w:w="1131"/>
+        <w:gridCol w:w="1131"/>
+        <w:gridCol w:w="1508"/>
+        <w:gridCol w:w="1508"/>
+        <w:gridCol w:w="1508"/>
       </w:tblGrid>
       <w:tr>
         <w:trPr>
@@ -6502,6 +6508,7 @@
           <w:p>
             <w:pPr>
               <w:pStyle w:val="Compact"/>
+              <w:jc w:val="right"/>
             </w:pPr>
             <w:r>
               <w:t xml:space="preserve">TJM chargé</w:t>
@@ -6513,17 +6520,19 @@
           <w:p>
             <w:pPr>
               <w:pStyle w:val="Compact"/>
-            </w:pPr>
-            <w:r>
-              <w:t xml:space="preserve">Jours mobilisés</w:t>
-            </w:r>
-          </w:p>
-        </w:tc>
-        <w:tc>
-          <w:tcPr/>
-          <w:p>
-            <w:pPr>
-              <w:pStyle w:val="Compact"/>
+              <w:jc w:val="right"/>
+            </w:pPr>
+            <w:r>
+              <w:t xml:space="preserve">Jours mobilisés (cf. Gantt)</w:t>
+            </w:r>
+          </w:p>
+        </w:tc>
+        <w:tc>
+          <w:tcPr/>
+          <w:p>
+            <w:pPr>
+              <w:pStyle w:val="Compact"/>
+              <w:jc w:val="right"/>
             </w:pPr>
             <w:r>
               <w:t xml:space="preserve">Coût total</w:t>
@@ -6570,6 +6579,7 @@
           <w:p>
             <w:pPr>
               <w:pStyle w:val="Compact"/>
+              <w:jc w:val="right"/>
             </w:pPr>
             <w:r>
               <w:t xml:space="preserve">300 €</w:t>
@@ -6581,6 +6591,7 @@
           <w:p>
             <w:pPr>
               <w:pStyle w:val="Compact"/>
+              <w:jc w:val="right"/>
             </w:pPr>
             <w:r>
               <w:t xml:space="preserve">90 j</w:t>
@@ -6592,8 +6603,13 @@
           <w:p>
             <w:pPr>
               <w:pStyle w:val="Compact"/>
-            </w:pPr>
-            <w:r>
+              <w:jc w:val="right"/>
+            </w:pPr>
+            <w:r>
+              <w:rPr>
+                <w:b/>
+                <w:bCs/>
+              </w:rPr>
               <w:t xml:space="preserve">27 000 €</w:t>
             </w:r>
           </w:p>
@@ -6638,6 +6654,7 @@
           <w:p>
             <w:pPr>
               <w:pStyle w:val="Compact"/>
+              <w:jc w:val="right"/>
             </w:pPr>
             <w:r>
               <w:t xml:space="preserve">330 €</w:t>
@@ -6649,6 +6666,7 @@
           <w:p>
             <w:pPr>
               <w:pStyle w:val="Compact"/>
+              <w:jc w:val="right"/>
             </w:pPr>
             <w:r>
               <w:t xml:space="preserve">10 j</w:t>
@@ -6660,8 +6678,13 @@
           <w:p>
             <w:pPr>
               <w:pStyle w:val="Compact"/>
-            </w:pPr>
-            <w:r>
+              <w:jc w:val="right"/>
+            </w:pPr>
+            <w:r>
+              <w:rPr>
+                <w:b/>
+                <w:bCs/>
+              </w:rPr>
               <w:t xml:space="preserve">3 300 €</w:t>
             </w:r>
           </w:p>
@@ -6706,6 +6729,7 @@
           <w:p>
             <w:pPr>
               <w:pStyle w:val="Compact"/>
+              <w:jc w:val="right"/>
             </w:pPr>
             <w:r>
               <w:t xml:space="preserve">90 €</w:t>
@@ -6717,6 +6741,7 @@
           <w:p>
             <w:pPr>
               <w:pStyle w:val="Compact"/>
+              <w:jc w:val="right"/>
             </w:pPr>
             <w:r>
               <w:t xml:space="preserve">60 j</w:t>
@@ -6728,8 +6753,13 @@
           <w:p>
             <w:pPr>
               <w:pStyle w:val="Compact"/>
-            </w:pPr>
-            <w:r>
+              <w:jc w:val="right"/>
+            </w:pPr>
+            <w:r>
+              <w:rPr>
+                <w:b/>
+                <w:bCs/>
+              </w:rPr>
               <w:t xml:space="preserve">5 400 €</w:t>
             </w:r>
           </w:p>
@@ -6774,6 +6804,7 @@
           <w:p>
             <w:pPr>
               <w:pStyle w:val="Compact"/>
+              <w:jc w:val="right"/>
             </w:pPr>
             <w:r>
               <w:t xml:space="preserve">90 €</w:t>
@@ -6785,6 +6816,7 @@
           <w:p>
             <w:pPr>
               <w:pStyle w:val="Compact"/>
+              <w:jc w:val="right"/>
             </w:pPr>
             <w:r>
               <w:t xml:space="preserve">56 j</w:t>
@@ -6796,8 +6828,13 @@
           <w:p>
             <w:pPr>
               <w:pStyle w:val="Compact"/>
-            </w:pPr>
-            <w:r>
+              <w:jc w:val="right"/>
+            </w:pPr>
+            <w:r>
+              <w:rPr>
+                <w:b/>
+                <w:bCs/>
+              </w:rPr>
               <w:t xml:space="preserve">5 040 €</w:t>
             </w:r>
           </w:p>
@@ -6842,6 +6879,7 @@
           <w:p>
             <w:pPr>
               <w:pStyle w:val="Compact"/>
+              <w:jc w:val="right"/>
             </w:pPr>
             <w:r>
               <w:t xml:space="preserve">305 €</w:t>
@@ -6853,6 +6891,7 @@
           <w:p>
             <w:pPr>
               <w:pStyle w:val="Compact"/>
+              <w:jc w:val="right"/>
             </w:pPr>
             <w:r>
               <w:t xml:space="preserve">12 j</w:t>
@@ -6864,8 +6903,13 @@
           <w:p>
             <w:pPr>
               <w:pStyle w:val="Compact"/>
-            </w:pPr>
-            <w:r>
+              <w:jc w:val="right"/>
+            </w:pPr>
+            <w:r>
+              <w:rPr>
+                <w:b/>
+                <w:bCs/>
+              </w:rPr>
               <w:t xml:space="preserve">3 660 €</w:t>
             </w:r>
           </w:p>
@@ -6910,6 +6954,7 @@
           <w:p>
             <w:pPr>
               <w:pStyle w:val="Compact"/>
+              <w:jc w:val="right"/>
             </w:pPr>
             <w:r>
               <w:t xml:space="preserve">305 €</w:t>
@@ -6921,6 +6966,7 @@
           <w:p>
             <w:pPr>
               <w:pStyle w:val="Compact"/>
+              <w:jc w:val="right"/>
             </w:pPr>
             <w:r>
               <w:t xml:space="preserve">12 j</w:t>
@@ -6932,8 +6978,13 @@
           <w:p>
             <w:pPr>
               <w:pStyle w:val="Compact"/>
-            </w:pPr>
-            <w:r>
+              <w:jc w:val="right"/>
+            </w:pPr>
+            <w:r>
+              <w:rPr>
+                <w:b/>
+                <w:bCs/>
+              </w:rPr>
               <w:t xml:space="preserve">3 660 €</w:t>
             </w:r>
           </w:p>
@@ -6978,6 +7029,7 @@
           <w:p>
             <w:pPr>
               <w:pStyle w:val="Compact"/>
+              <w:jc w:val="right"/>
             </w:pPr>
             <w:r>
               <w:t xml:space="preserve">530 €</w:t>
@@ -6989,6 +7041,7 @@
           <w:p>
             <w:pPr>
               <w:pStyle w:val="Compact"/>
+              <w:jc w:val="right"/>
             </w:pPr>
             <w:r>
               <w:t xml:space="preserve">5 j (plafond contractuel)</w:t>
@@ -7000,8 +7053,13 @@
           <w:p>
             <w:pPr>
               <w:pStyle w:val="Compact"/>
-            </w:pPr>
-            <w:r>
+              <w:jc w:val="right"/>
+            </w:pPr>
+            <w:r>
+              <w:rPr>
+                <w:b/>
+                <w:bCs/>
+              </w:rPr>
               <w:t xml:space="preserve">2 650 €</w:t>
             </w:r>
           </w:p>
@@ -7046,6 +7104,7 @@
           <w:p>
             <w:pPr>
               <w:pStyle w:val="Compact"/>
+              <w:jc w:val="right"/>
             </w:pPr>
             <w:r>
               <w:t xml:space="preserve">530 €</w:t>
@@ -7057,6 +7116,7 @@
           <w:p>
             <w:pPr>
               <w:pStyle w:val="Compact"/>
+              <w:jc w:val="right"/>
             </w:pPr>
             <w:r>
               <w:t xml:space="preserve">5 j (plafond contractuel)</w:t>
@@ -7068,8 +7128,13 @@
           <w:p>
             <w:pPr>
               <w:pStyle w:val="Compact"/>
-            </w:pPr>
-            <w:r>
+              <w:jc w:val="right"/>
+            </w:pPr>
+            <w:r>
+              <w:rPr>
+                <w:b/>
+                <w:bCs/>
+              </w:rPr>
               <w:t xml:space="preserve">2 650 €</w:t>
             </w:r>
           </w:p>
@@ -7114,6 +7179,7 @@
           <w:p>
             <w:pPr>
               <w:pStyle w:val="Compact"/>
+              <w:jc w:val="right"/>
             </w:pPr>
             <w:r>
               <w:t xml:space="preserve">670 €</w:t>
@@ -7125,6 +7191,7 @@
           <w:p>
             <w:pPr>
               <w:pStyle w:val="Compact"/>
+              <w:jc w:val="right"/>
             </w:pPr>
             <w:r>
               <w:t xml:space="preserve">6 j (temps cumulé sur 4 mois)</w:t>
@@ -7136,8 +7203,13 @@
           <w:p>
             <w:pPr>
               <w:pStyle w:val="Compact"/>
-            </w:pPr>
-            <w:r>
+              <w:jc w:val="right"/>
+            </w:pPr>
+            <w:r>
+              <w:rPr>
+                <w:b/>
+                <w:bCs/>
+              </w:rPr>
               <w:t xml:space="preserve">4 020 €</w:t>
             </w:r>
           </w:p>
@@ -7188,6 +7260,7 @@
           <w:p>
             <w:pPr>
               <w:pStyle w:val="Compact"/>
+              <w:jc w:val="right"/>
             </w:pPr>
             <w:r>
               <w:rPr>
@@ -7203,6 +7276,7 @@
           <w:p>
             <w:pPr>
               <w:pStyle w:val="Compact"/>
+              <w:jc w:val="right"/>
             </w:pPr>
             <w:r>
               <w:rPr>
@@ -7233,9 +7307,9 @@
         <w:tblLook w:firstRow="1" w:lastRow="0" w:firstColumn="0" w:lastColumn="0" w:noHBand="0" w:noVBand="0" w:val="0020"/>
       </w:tblPr>
       <w:tblGrid>
-        <w:gridCol w:w="2640"/>
-        <w:gridCol w:w="2640"/>
-        <w:gridCol w:w="2640"/>
+        <w:gridCol w:w="2376"/>
+        <w:gridCol w:w="2376"/>
+        <w:gridCol w:w="3168"/>
       </w:tblGrid>
       <w:tr>
         <w:trPr>
@@ -7268,6 +7342,7 @@
           <w:p>
             <w:pPr>
               <w:pStyle w:val="Compact"/>
+              <w:jc w:val="right"/>
             </w:pPr>
             <w:r>
               <w:t xml:space="preserve">Coût annuel</w:t>
@@ -7327,6 +7402,7 @@
           <w:p>
             <w:pPr>
               <w:pStyle w:val="Compact"/>
+              <w:jc w:val="right"/>
             </w:pPr>
             <w:r>
               <w:t xml:space="preserve">35 €</w:t>
@@ -7362,6 +7438,7 @@
           <w:p>
             <w:pPr>
               <w:pStyle w:val="Compact"/>
+              <w:jc w:val="right"/>
             </w:pPr>
             <w:r>
               <w:t xml:space="preserve">1 450 €</w:t>
@@ -7397,6 +7474,7 @@
           <w:p>
             <w:pPr>
               <w:pStyle w:val="Compact"/>
+              <w:jc w:val="right"/>
             </w:pPr>
             <w:r>
               <w:t xml:space="preserve">240 €</w:t>
@@ -7432,6 +7510,7 @@
           <w:p>
             <w:pPr>
               <w:pStyle w:val="Compact"/>
+              <w:jc w:val="right"/>
             </w:pPr>
             <w:r>
               <w:t xml:space="preserve">312 €</w:t>
@@ -7467,6 +7546,7 @@
           <w:p>
             <w:pPr>
               <w:pStyle w:val="Compact"/>
+              <w:jc w:val="right"/>
             </w:pPr>
             <w:r>
               <w:t xml:space="preserve">120 €</w:t>
@@ -7502,9 +7582,20 @@
           <w:p>
             <w:pPr>
               <w:pStyle w:val="Compact"/>
-            </w:pPr>
-            <w:r>
-              <w:t xml:space="preserve">100 € (one-shot, cf. §1.8)</w:t>
+              <w:jc w:val="right"/>
+            </w:pPr>
+            <w:r>
+              <w:t xml:space="preserve">100 €</w:t>
+            </w:r>
+            <w:r>
+              <w:t xml:space="preserve"> </w:t>
+            </w:r>
+            <w:r>
+              <w:rPr>
+                <w:i/>
+                <w:iCs/>
+              </w:rPr>
+              <w:t xml:space="preserve">(one-shot, cf. §1.8)</w:t>
             </w:r>
           </w:p>
         </w:tc>
@@ -7538,6 +7629,7 @@
           <w:p>
             <w:pPr>
               <w:pStyle w:val="Compact"/>
+              <w:jc w:val="right"/>
             </w:pPr>
             <w:r>
               <w:rPr>
@@ -7580,9 +7672,9 @@
         <w:tblLook w:firstRow="1" w:lastRow="0" w:firstColumn="0" w:lastColumn="0" w:noHBand="0" w:noVBand="0" w:val="0020"/>
       </w:tblPr>
       <w:tblGrid>
-        <w:gridCol w:w="2640"/>
-        <w:gridCol w:w="2640"/>
-        <w:gridCol w:w="2640"/>
+        <w:gridCol w:w="2376"/>
+        <w:gridCol w:w="2376"/>
+        <w:gridCol w:w="3168"/>
       </w:tblGrid>
       <w:tr>
         <w:trPr>
@@ -7615,6 +7707,7 @@
           <w:p>
             <w:pPr>
               <w:pStyle w:val="Compact"/>
+              <w:jc w:val="right"/>
             </w:pPr>
             <w:r>
               <w:t xml:space="preserve">Coût annuel</w:t>
@@ -7650,6 +7743,7 @@
           <w:p>
             <w:pPr>
               <w:pStyle w:val="Compact"/>
+              <w:jc w:val="right"/>
             </w:pPr>
             <w:r>
               <w:t xml:space="preserve">3 600 €</w:t>
@@ -7676,8 +7770,8 @@
         <w:tblLook w:firstRow="1" w:lastRow="0" w:firstColumn="0" w:lastColumn="0" w:noHBand="0" w:noVBand="0" w:val="0020"/>
       </w:tblPr>
       <w:tblGrid>
-        <w:gridCol w:w="3960"/>
-        <w:gridCol w:w="3960"/>
+        <w:gridCol w:w="3394"/>
+        <w:gridCol w:w="4525"/>
       </w:tblGrid>
       <w:tr>
         <w:trPr>
@@ -7699,6 +7793,7 @@
           <w:p>
             <w:pPr>
               <w:pStyle w:val="Compact"/>
+              <w:jc w:val="right"/>
             </w:pPr>
             <w:r>
               <w:t xml:space="preserve">Montant HT</w:t>
@@ -7723,6 +7818,7 @@
           <w:p>
             <w:pPr>
               <w:pStyle w:val="Compact"/>
+              <w:jc w:val="right"/>
             </w:pPr>
             <w:r>
               <w:t xml:space="preserve">57 380 €</w:t>
@@ -7747,6 +7843,7 @@
           <w:p>
             <w:pPr>
               <w:pStyle w:val="Compact"/>
+              <w:jc w:val="right"/>
             </w:pPr>
             <w:r>
               <w:t xml:space="preserve">2 257 €</w:t>
@@ -7771,6 +7868,7 @@
           <w:p>
             <w:pPr>
               <w:pStyle w:val="Compact"/>
+              <w:jc w:val="right"/>
             </w:pPr>
             <w:r>
               <w:t xml:space="preserve">3 600 €</w:t>
@@ -7799,6 +7897,7 @@
           <w:p>
             <w:pPr>
               <w:pStyle w:val="Compact"/>
+              <w:jc w:val="right"/>
             </w:pPr>
             <w:r>
               <w:rPr>
@@ -7827,6 +7926,7 @@
           <w:p>
             <w:pPr>
               <w:pStyle w:val="Compact"/>
+              <w:jc w:val="right"/>
             </w:pPr>
             <w:r>
               <w:t xml:space="preserve">6 324 €</w:t>
@@ -7855,6 +7955,7 @@
           <w:p>
             <w:pPr>
               <w:pStyle w:val="Compact"/>
+              <w:jc w:val="right"/>
             </w:pPr>
             <w:r>
               <w:rPr>
@@ -7868,7 +7969,7 @@
       </w:tr>
     </w:tbl>
     <w:bookmarkEnd w:id="36"/>
-    <w:bookmarkStart w:id="37" w:name="sources"/>
+    <w:bookmarkStart w:id="42" w:name="sources"/>
     <w:p>
       <w:pPr>
         <w:pStyle w:val="Heading2"/>
@@ -7885,9 +7986,14 @@
           <w:numId w:val="1007"/>
         </w:numPr>
       </w:pPr>
-      <w:r>
-        <w:t xml:space="preserve">Salaire développeur full stack (H/F) — Indeed.fr : https://fr.indeed.com/career/d%C3%A9veloppeur-full-stack/salaries</w:t>
-      </w:r>
+      <w:hyperlink r:id="rId37">
+        <w:r>
+          <w:rPr>
+            <w:rStyle w:val="Hyperlink"/>
+          </w:rPr>
+          <w:t xml:space="preserve">Salaire développeur full stack (H/F) — Indeed.fr</w:t>
+        </w:r>
+      </w:hyperlink>
     </w:p>
     <w:p>
       <w:pPr>
@@ -7897,9 +8003,14 @@
           <w:numId w:val="1007"/>
         </w:numPr>
       </w:pPr>
-      <w:r>
-        <w:t xml:space="preserve">Salaire UI/UX designer (H/F) — Indeed.fr : https://fr.indeed.com/career/ui%2Fux-designer/salaries?hl=fr</w:t>
-      </w:r>
+      <w:hyperlink r:id="rId38">
+        <w:r>
+          <w:rPr>
+            <w:rStyle w:val="Hyperlink"/>
+          </w:rPr>
+          <w:t xml:space="preserve">Salaire UI/UX designer (H/F) — Indeed.fr</w:t>
+        </w:r>
+      </w:hyperlink>
     </w:p>
     <w:p>
       <w:pPr>
@@ -7909,9 +8020,14 @@
           <w:numId w:val="1007"/>
         </w:numPr>
       </w:pPr>
-      <w:r>
-        <w:t xml:space="preserve">Salaire apprenti développeur (H/F) — Indeed.fr : https://fr.indeed.com/career/apprenti-d%C3%A9veloppeur/salaries</w:t>
-      </w:r>
+      <w:hyperlink r:id="rId39">
+        <w:r>
+          <w:rPr>
+            <w:rStyle w:val="Hyperlink"/>
+          </w:rPr>
+          <w:t xml:space="preserve">Salaire apprenti développeur (H/F) — Indeed.fr</w:t>
+        </w:r>
+      </w:hyperlink>
     </w:p>
     <w:p>
       <w:pPr>
@@ -7921,9 +8037,14 @@
           <w:numId w:val="1007"/>
         </w:numPr>
       </w:pPr>
-      <w:r>
-        <w:t xml:space="preserve">TJM freelance développeur fullstack 2026 — FreelanceMention : https://freelancemention.fr/blog/tjm-freelance-developpeur-fullstack/</w:t>
-      </w:r>
+      <w:hyperlink r:id="rId40">
+        <w:r>
+          <w:rPr>
+            <w:rStyle w:val="Hyperlink"/>
+          </w:rPr>
+          <w:t xml:space="preserve">TJM freelance développeur fullstack 2026 — FreelanceMention</w:t>
+        </w:r>
+      </w:hyperlink>
     </w:p>
     <w:p>
       <w:pPr>
@@ -7933,12 +8054,17 @@
           <w:numId w:val="1007"/>
         </w:numPr>
       </w:pPr>
-      <w:r>
-        <w:t xml:space="preserve">Salaire chef d’entreprise / directeur de PME — Indeed.fr : https://fr.indeed.com/conseils-carrieres/remuneration-salaire/combien-gagne-chef-entreprise</w:t>
-      </w:r>
+      <w:hyperlink r:id="rId41">
+        <w:r>
+          <w:rPr>
+            <w:rStyle w:val="Hyperlink"/>
+          </w:rPr>
+          <w:t xml:space="preserve">Salaire chef d’entreprise / directeur de PME — Indeed.fr</w:t>
+        </w:r>
+      </w:hyperlink>
     </w:p>
-    <w:bookmarkEnd w:id="37"/>
-    <w:bookmarkEnd w:id="38"/>
+    <w:bookmarkEnd w:id="42"/>
+    <w:bookmarkEnd w:id="43"/>
     <w:sectPr>
       <w:footnotePr>
         <w:numRestart w:val="eachSect"/>
@@ -8187,7 +8313,7 @@
         <w:rFonts w:asciiTheme="minorHAnsi" w:cstheme="minorBidi" w:eastAsiaTheme="minorEastAsia" w:hAnsiTheme="minorHAnsi"/>
         <w:sz w:val="24"/>
         <w:szCs w:val="24"/>
-        <w:lang w:bidi="ar-SA" w:eastAsia="zh-CN" w:val="en-US"/>
+        <w:lang w:bidi="ar-SA" w:eastAsia="zh-CN" w:val="fr-FR"/>
       </w:rPr>
     </w:rPrDefault>
     <w:pPrDefault>

</xml_diff>